<commit_message>
Update template so landscape can happen
</commit_message>
<xml_diff>
--- a/bib/template.docx
+++ b/bib/template.docx
@@ -7321,6 +7321,10 @@
     <w:qFormat/>
     <w:tblPr>
       <w:tblInd w:w="0" w:type="dxa"/>
+      <w:tblBorders>
+        <w:top w:val="single" w:sz="8" w:space="0" w:color="auto"/>
+        <w:bottom w:val="single" w:sz="8" w:space="0" w:color="auto"/>
+      </w:tblBorders>
       <w:tblCellMar>
         <w:top w:w="0" w:type="dxa"/>
         <w:left w:w="108" w:type="dxa"/>

</xml_diff>

<commit_message>
Fxiing some issues with how BACE works
</commit_message>
<xml_diff>
--- a/bib/template.docx
+++ b/bib/template.docx
@@ -6301,15 +6301,42 @@
       <w:bookmarkEnd w:id="61"/>
     </w:p>
     <w:sectPr>
+      <w:footerReference w:type="default" r:id="rId99"/>
       <w:footnotePr>
         <w:numRestart w:val="eachSect"/>
       </w:footnotePr>
       <w:pgSz w:w="12240" w:h="15840"/>
       <w:pgMar w:top="851" w:right="851" w:bottom="851" w:left="851" w:header="720" w:footer="720" w:gutter="0"/>
+      <w:lnNumType w:countBy="1" w:restart="continuous"/>
       <w:cols w:space="720"/>
     </w:sectPr>
   </w:body>
 </w:document>
+</file>
+
+<file path=word/footer1.xml><?xml version="1.0" encoding="utf-8"?>
+<w:ftr xmlns:w="http://schemas.openxmlformats.org/wordprocessingml/2006/main" xmlns:r="http://schemas.openxmlformats.org/officeDocument/2006/relationships">
+  <w:p>
+    <w:pPr>
+      <w:jc w:val="center"/>
+    </w:pPr>
+    <w:r>
+      <w:fldChar w:fldCharType="begin"/>
+    </w:r>
+    <w:r>
+      <w:instrText xml:space="preserve"> PAGE </w:instrText>
+    </w:r>
+    <w:r>
+      <w:fldChar w:fldCharType="separate"/>
+    </w:r>
+    <w:r>
+      <w:t>1</w:t>
+    </w:r>
+    <w:r>
+      <w:fldChar w:fldCharType="end"/>
+    </w:r>
+  </w:p>
+</w:ftr>
 </file>
 
 <file path=word/numbering.xml><?xml version="1.0" encoding="utf-8"?>

</xml_diff>